<commit_message>
docs: 명세서 FR-037·UC-007·UC-010 실거래가 API 방식으로 정리, CLAUDE.md PM/PO 반영
PR 리뷰(배승환) 1~3번 반영.

Co-Authored-By: Claude Sonnet 5.5 <noreply@anthropic.com>
</commit_message>
<xml_diff>
--- a/docs/srs/02_요구사항명세서(SRS)_전동기_v0.5.docx
+++ b/docs/srs/02_요구사항명세서(SRS)_전동기_v0.5.docx
@@ -14280,7 +14280,7 @@
                 <w:sz w:val="18"/>
                 <w:szCs w:val="18"/>
               </w:rPr>
-              <w:t xml:space="preserve">MVP: 데이터 파일 교체 후 배치 실행</w:t>
+              <w:t xml:space="preserve">MVP: 실거래가 API 수집 후 재계산 배치 실행 (공시가격은 파일 적재)</w:t>
             </w:r>
           </w:p>
         </w:tc>
@@ -29684,7 +29684,7 @@
                 <w:sz w:val="18"/>
                 <w:szCs w:val="18"/>
               </w:rPr>
-              <w:t xml:space="preserve">새 공시가격 또는 실거래 데이터 적재 완료</w:t>
+              <w:t xml:space="preserve">새 공시가격 파일 적재 또는 실거래가 API 수집 완료</w:t>
             </w:r>
           </w:p>
         </w:tc>
@@ -29754,7 +29754,7 @@
                 <w:sz w:val="18"/>
                 <w:szCs w:val="18"/>
               </w:rPr>
-              <w:t xml:space="preserve">데이터 적재 후 재계산 배치 실행</w:t>
+              <w:t xml:space="preserve">공시가격 적재 또는 실거래가 수집 후 재계산 배치 실행</w:t>
             </w:r>
           </w:p>
         </w:tc>
@@ -31712,7 +31712,7 @@
                 <w:sz w:val="18"/>
                 <w:szCs w:val="18"/>
               </w:rPr>
-              <w:t xml:space="preserve">1. 규칙 설정 파일을 근거·기준일과 함께 수정하거나 데이터 파일을 적재한다.</w:t>
+              <w:t xml:space="preserve">1. 규칙 설정 파일을 근거·기준일과 함께 수정하거나, 실거래가를 API로 수집하거나, 공시가격·건축물대장 파일을 적재한다.</w:t>
             </w:r>
           </w:p>
           <w:p>
@@ -31798,6 +31798,19 @@
             </w:tcMar>
             <w:vAlign w:val="center"/>
           </w:tcPr>
+          <w:p>
+            <w:pPr>
+              <w:spacing w:after="0" w:before="0" w:line="260"/>
+              <w:jc w:val="left"/>
+            </w:pPr>
+            <w:r>
+              <w:rPr>
+                <w:sz w:val="18"/>
+                <w:szCs w:val="18"/>
+              </w:rPr>
+              <w:t xml:space="preserve">1a. 실거래가 API 호출 실패 → 저장해 둔 자료나 내려받은 파일(CSV)로 적재하고 기준일 표시</w:t>
+            </w:r>
+          </w:p>
           <w:p>
             <w:pPr>
               <w:spacing w:after="0" w:before="0" w:line="260"/>

</xml_diff>

<commit_message>
docs: L-RATIO90을 set_due로, 부속표 A에 90% 예외, 버전 표기 정리
- linkage.yaml: move_before → set_due(anchor: contract_date). 결정(계약일 당일)을
  데이터로 표현하고 check_rules.py 허용 action도 바꿈. L-VIOLATION도 같은 형식,
  todos.yaml T2 prerequisites_skip_when에 L-VIOLATION 추가
- 명세서 부속표 A 2번 줄에 "비율 90% 이상이면 1번을 기다리지 않음" (md·docx)
- 자금 틈의 다음 집 잔금 = 보증금 − 계약금을 FR-026·기획서·정답표 Q5에 적음
- 시뮬레이터 표기 v1.1, 규칙 파일 basis·README 근거 v4.35·v0.5,
  deadline_scenarios.yaml version 0.2

Co-Authored-By: Claude Opus 5.5 <noreply@anthropic.com>
</commit_message>
<xml_diff>
--- a/docs/srs/02_요구사항명세서(SRS)_전동기_v0.5.docx
+++ b/docs/srs/02_요구사항명세서(SRS)_전동기_v0.5.docx
@@ -11647,7 +11647,7 @@
                 <w:sz w:val="18"/>
                 <w:szCs w:val="18"/>
               </w:rPr>
-              <w:t xml:space="preserve">지금 집 보증금 반환 예정일과 다음 집 계약금·잔금일을 비교해, 반환이 늦으면 비는 기간(일)과 금액(지금 집 보증금과 다음 집 잔금 중 작은 금액)을 표시해야 한다. 전세대출이 있으면 기존 대출 상환과 새 대출 실행 순서를 함께 보여 줘야 한다.</w:t>
+              <w:t xml:space="preserve">지금 집 보증금 반환 예정일과 다음 집 계약금·잔금일을 비교해, 반환이 늦으면 비는 기간(일)과 금액(지금 집 보증금과 다음 집 잔금(보증금 − 계약금) 중 작은 금액)을 표시해야 한다. 전세대출이 있으면 기존 대출 상환과 새 대출 실행 순서를 함께 보여 줘야 한다.</w:t>
             </w:r>
           </w:p>
         </w:tc>
@@ -18156,7 +18156,7 @@
                 <w:sz w:val="18"/>
                 <w:szCs w:val="18"/>
               </w:rPr>
-              <w:t xml:space="preserve">1번 선행 (신고 비대상이면 계약 직후 바로 시작). 직거래면 잔금 전 보증기관 상담으로 대체. 해제 특약을 거절당했으면 맨 위</w:t>
+              <w:t xml:space="preserve">1번 선행 (신고 비대상이면 계약 직후 바로 시작, 보증금 비율 90% 이상이면 기한이 계약일로 당겨져 1번을 기다리지 않음). 직거래면 잔금 전 보증기관 상담으로 대체. 해제 특약을 거절당했으면 맨 위</w:t>
             </w:r>
           </w:p>
         </w:tc>

</xml_diff>

<commit_message>
docs: 리뷰 반영 — CLAUDE.md 기술 스택 Expo, 명세서 2.1·2.3 Client를 MVP 웹 → 이후 앱으로
- CLAUDE.md MVP 절 기술 스택 "React PWA" → "Expo(React Native, Expo Router, 웹은 PWA)"
- 명세서 v0.5(md·docx) 2.1 "독립형 모바일 웹 서비스(PWA)", 2.3 Client 줄을 Frontend 줄과 맞춤:
  MVP는 모바일 웹(PWA), 이후 같은 코드로 안드로이드·iOS 앱
- main 병합 (#26 등)

Co-Authored-By: Claude Opus 5.5 <noreply@anthropic.com>
</commit_message>
<xml_diff>
--- a/docs/srs/02_요구사항명세서(SRS)_전동기_v0.5.docx
+++ b/docs/srs/02_요구사항명세서(SRS)_전동기_v0.5.docx
@@ -3717,7 +3717,7 @@
         <w:spacing w:after="120" w:line="320"/>
       </w:pPr>
       <w:r>
-        <w:t>전동기는 독립형 모바일 웹 서비스(PWA)다. 보증기관 등 공식 창구 시스템과 직접 연동하지 않고, 공공 데이터(실거래가는 공공데이터포털 API, 공시가격·건축물대장은 파일)와 사용자가 올린 자료로 계산한 뒤 공식 창구는 링크로 연결한다.</w:t>
+        <w:t>전동기는 독립형 서비스로, MVP는 모바일 웹(PWA)으로 제공하고 이후 같은 코드(Expo)로 안드로이드·iOS 앱을 낸다. 보증기관 등 공식 창구 시스템과 직접 연동하지 않고, 공공 데이터(실거래가는 공공데이터포털 API, 공시가격·건축물대장은 파일)와 사용자가 올린 자료로 계산한 뒤 공식 창구는 링크로 연결한다.</w:t>
       </w:r>
     </w:p>
     <w:tbl>
@@ -5449,7 +5449,7 @@
         <w:t xml:space="preserve">Client:</w:t>
       </w:r>
       <w:r>
-        <w:t xml:space="preserve"> 모바일 웹(PWA) — iOS Safari, Android Chrome 최신 버전 / 데스크톱 Chrome·Edge 최신 버전</w:t>
+        <w:t xml:space="preserve"> MVP는 모바일 웹(PWA) — iOS Safari, Android Chrome 최신 버전 / 데스크톱 Chrome·Edge 최신 버전. 이후 같은 코드로 안드로이드·iOS 앱</w:t>
       </w:r>
     </w:p>
     <w:p>

</xml_diff>